<commit_message>
Rewrite the research-paper briefs in the foundation's voice
The two paper write-ups spoke in the researchers' voice ("In our study we
found"), inherited from the 2024 release and from the source documents.
They now speak about the research instead, in English and Arabic alike:
"The study found", "The team measured", "وقد وجدت الدراسة", "وقاس الفريق
البحثي". Only the voice changed; every statement and its source stand.

The rule is recorded in README.md so the three papers and two projects
still under arbitration are drafted the same way.

Co-Authored-By: Claude Opus 5 <noreply@anthropic.com>
Claude-Session: https://claude.ai/code/session_018MhQXadAbw2Qxg331AjnZL
</commit_message>
<xml_diff>
--- a/output/winners-press-release-2026-ar.docx
+++ b/output/winners-press-release-2026-ar.docx
@@ -288,7 +288,7 @@
                 <w:szCs w:val="22"/>
                 <w:rtl/>
               </w:rPr>
-              <w:t>يُعدّ البروتين الغلافي للفيروس القهقري الداخلي المنشأ من النوع W، المعروف اختصاراً بـ pHERV-W ENV، من العوامل المرتبطة بآلية نشوء التصلب المتعدد، غير أنّ فائدته السريرية كمؤشر حيوي لم تكن محددة بوضوح. وقد وجدنا في دراستنا أنّ هذا البروتين يتركّز على الحويصلات خارج الخلوية (الإكسوسومات) المستخلصة من مصل الدم لدى المصابين بالتصلب المتعدد الانتكاسي الهاجع، وأنّه يعكس نشاط المرض الحالي واحتمالات تطوّره مستقبلاً.</w:t>
+              <w:t>يُعدّ البروتين الغلافي للفيروس القهقري الداخلي المنشأ من النوع W، المعروف اختصاراً بـ pHERV-W ENV، من العوامل المرتبطة بآلية نشوء التصلب المتعدد، غير أنّ فائدته السريرية كمؤشر حيوي لم تكن محددة بوضوح. وقد وجدت الدراسة أنّ هذا البروتين يتركّز على الحويصلات خارج الخلوية (الإكسوسومات) المستخلصة من مصل الدم لدى المصابين بالتصلب المتعدد الانتكاسي الهاجع، وأنّه يعكس نشاط المرض الحالي واحتمالات تطوّره مستقبلاً.</w:t>
             </w:r>
           </w:p>
           <w:p>
@@ -304,7 +304,7 @@
                 <w:szCs w:val="22"/>
                 <w:rtl/>
               </w:rPr>
-              <w:t>قِسنا مستويات هذا البروتين لدى ثلاث مجموعات: مجموعة قارنّا فيها أشخاصاً أصحّاء بمرضى مستقرّين وآخرين في طور نشاط المرض؛ ومجموعة تابعناها قبل نوبات النشاط وأثناءها وبعدها؛ ومجموعة من المرضى حديثي التشخيص تابعناهم على مدى ثلاث سنوات.</w:t>
+              <w:t>وقاس الفريق البحثي مستويات هذا البروتين لدى ثلاث مجموعات: مجموعة قارنّا فيها أشخاصاً أصحّاء بمرضى مستقرّين وآخرين في طور نشاط المرض؛ ومجموعة جرت متابعتها قبل نوبات النشاط وأثناءها وبعدها؛ ومجموعة من المرضى حديثي التشخيص جرت متابعتهم على مدى ثلاث سنوات.</w:t>
             </w:r>
           </w:p>
           <w:p>
@@ -336,7 +336,7 @@
                 <w:szCs w:val="22"/>
                 <w:rtl/>
               </w:rPr>
-              <w:t>وعليه فقد يصلح هذا البروتين مؤشراً حيوياً ديناميكياً غير باضع لنشاط التصلب المتعدد، ذا قيمة في التنبؤ بمسار المرض.</w:t>
+              <w:t>وتشير النتائج إلى أنّ هذا البروتين قد يصلح مؤشراً حيوياً ديناميكياً غير باضع لنشاط التصلب المتعدد، ذا قيمة في التنبؤ بمسار المرض.</w:t>
             </w:r>
           </w:p>
         </w:tc>
@@ -424,7 +424,7 @@
                 <w:szCs w:val="22"/>
                 <w:rtl/>
               </w:rPr>
-              <w:t>لطالما أغفلت المراجع الجينومية العالمية المعتمدة تمثيل الشعوب العربية. وقد بنينا في دراستنا أول مرجع جينومي عربي شامل، اعتماداً على تسلسل الحمض النووي عالي الجودة بتقنية القراءات الطويلة لـ53 شخصاً من خلفيات عربية متنوّعة في دولة الإمارات. وأُجريت جميع مراحل البحث داخل مركز علم الجينوم التطبيقي والانتقالي في جامعة محمد بن راشد للطب والعلوم الصحية، ذراع التعلّم والاكتشاف في «دبي الصحية»، بدءاً من التسلسل الجيني ووصولاً إلى تحليلات المعلوماتية الحيوية المتقدمة.</w:t>
+              <w:t>لطالما أغفلت المراجع الجينومية العالمية المعتمدة تمثيل الشعوب العربية. وقد بنت هذه الدراسة أول مرجع جينومي عربي شامل، اعتماداً على تسلسل الحمض النووي عالي الجودة بتقنية القراءات الطويلة لـ53 شخصاً من خلفيات عربية متنوّعة في دولة الإمارات. وأُجريت جميع مراحل البحث داخل مركز علم الجينوم التطبيقي والانتقالي في جامعة محمد بن راشد للطب والعلوم الصحية، ذراع التعلّم والاكتشاف في «دبي الصحية»، بدءاً من التسلسل الجيني ووصولاً إلى تحليلات المعلوماتية الحيوية المتقدمة.</w:t>
             </w:r>
           </w:p>
           <w:p>

</xml_diff>

<commit_message>
Apply the first ten Arabic wording decisions
Reviewed term by term with the foundation. Changes applied:

- EMINS is الجمعية الإماراتية لطب الأعصاب
- pangenome paper title is مسودة مرجع البانجينوم العربي المستند إلى
  بيانات من دولة الإمارات العربية المتحدة
- Dr. Al Madani's name is شافعي, not شافي (corrected by the foundation;
  I could not verify this spelling from any source)
- relapsing-remitting MS is التصلب المتعدد متكرر الانتكاس والخمود

Confirmed unchanged: التصلب المتعدد, الجامعة الأمريكية في بيروت, the MS
paper title, both personality name forms, and the Tohme centre.

data/arabic-decisions.md records each decision so later write-ups follow
them without re-asking.

Co-Authored-By: Claude Opus 5 <noreply@anthropic.com>
Claude-Session: https://claude.ai/code/session_018MhQXadAbw2Qxg331AjnZL
</commit_message>
<xml_diff>
--- a/output/winners-press-release-2026-ar.docx
+++ b/output/winners-press-release-2026-ar.docx
@@ -288,7 +288,7 @@
                 <w:szCs w:val="22"/>
                 <w:rtl/>
               </w:rPr>
-              <w:t>يُعدّ البروتين الغلافي للفيروس القهقري الداخلي المنشأ من النوع W، المعروف اختصاراً بـ pHERV-W ENV، من العوامل المرتبطة بآلية نشوء التصلب المتعدد، غير أنّ فائدته السريرية كمؤشر حيوي لم تكن محددة بوضوح. وقد وجدت الدراسة أنّ هذا البروتين يتركّز على الحويصلات خارج الخلوية (الإكسوسومات) المستخلصة من مصل الدم لدى المصابين بالتصلب المتعدد الانتكاسي الهاجع، وأنّه يعكس نشاط المرض الحالي واحتمالات تطوّره مستقبلاً.</w:t>
+              <w:t>يُعدّ البروتين الغلافي للفيروس القهقري الداخلي المنشأ من النوع W، المعروف اختصاراً بـ pHERV-W ENV، من العوامل المرتبطة بآلية نشوء التصلب المتعدد، غير أنّ فائدته السريرية كمؤشر حيوي لم تكن محددة بوضوح. وقد وجدت الدراسة أنّ هذا البروتين يتركّز على الحويصلات خارج الخلوية (الإكسوسومات) المستخلصة من مصل الدم لدى المصابين بالتصلب المتعدد متكرر الانتكاس والخمود، وأنّه يعكس نشاط المرض الحالي واحتمالات تطوّره مستقبلاً.</w:t>
             </w:r>
           </w:p>
           <w:p>
@@ -382,7 +382,7 @@
                 <w:szCs w:val="22"/>
                 <w:rtl/>
               </w:rPr>
-              <w:t>مرجع أولي للجينوم الشامل (البانجينوم) العربي من دولة الإمارات العربية المتحدة.</w:t>
+              <w:t>مسودة مرجع البانجينوم العربي المستند إلى بيانات من دولة الإمارات العربية المتحدة.</w:t>
             </w:r>
           </w:p>
         </w:tc>
@@ -1392,7 +1392,7 @@
                 <w:szCs w:val="22"/>
                 <w:rtl/>
               </w:rPr>
-              <w:t>الدكتور أبوبكر عبدالرحمن شافي المدني</w:t>
+              <w:t>الدكتور أبوبكر عبدالرحمن شافعي المدني</w:t>
             </w:r>
           </w:p>
         </w:tc>
@@ -1434,7 +1434,7 @@
                 <w:szCs w:val="22"/>
                 <w:rtl/>
               </w:rPr>
-              <w:t>الدكتور أبوبكر عبدالرحمن شافي المدني استشاري أمراض المخ والأعصاب ورئيس قسم طب الأعصاب بمستشفى راشد، وأستاذ طب الأعصاب بجامعة محمد بن راشد للطب والعلوم الصحية. وبقيادته للقسم منذ عام 2011، بنى أكبر خدمة لطب الأعصاب في دولة الإمارات العربية المتحدة، تُعنى بأكثر من 20 ألف مريض سنوياً عبر مستشفيات راشد ودبي ولطيفة.</w:t>
+              <w:t>الدكتور أبوبكر عبدالرحمن شافعي المدني استشاري أمراض المخ والأعصاب ورئيس قسم طب الأعصاب بمستشفى راشد، وأستاذ طب الأعصاب بجامعة محمد بن راشد للطب والعلوم الصحية. وبقيادته للقسم منذ عام 2011، بنى أكبر خدمة لطب الأعصاب في دولة الإمارات العربية المتحدة، تُعنى بأكثر من 20 ألف مريض سنوياً عبر مستشفيات راشد ودبي ولطيفة.</w:t>
             </w:r>
           </w:p>
           <w:p>
@@ -1482,7 +1482,7 @@
                 <w:szCs w:val="22"/>
                 <w:rtl/>
               </w:rPr>
-              <w:t>وهو عضو في الهيئة التدريسية الأساسية لبرنامج الإقامة في طب الأعصاب بمستشفى راشد، ونائب رئيس جمعية الإمارات لطب الأعصاب، وله أكثر من 40 بحثاً محكّماً، وأسهم في أول إرشادات علاجية وطنية للتصلب المتعدد في دولة الإمارات — المعتمدة اليوم ضمن برنامج «إجادة» بهيئة الصحة بدبي — وفي الإطار الوطني لمرض الزهايمر في الدولة.</w:t>
+              <w:t>وهو عضو في الهيئة التدريسية الأساسية لبرنامج الإقامة في طب الأعصاب بمستشفى راشد، ونائب رئيس الجمعية الإماراتية لطب الأعصاب، وله أكثر من 40 بحثاً محكّماً، وأسهم في أول إرشادات علاجية وطنية للتصلب المتعدد في دولة الإمارات — المعتمدة اليوم ضمن برنامج «إجادة» بهيئة الصحة بدبي — وفي الإطار الوطني لمرض الزهايمر في الدولة.</w:t>
             </w:r>
           </w:p>
         </w:tc>

</xml_diff>

<commit_message>
Finish the Arabic term review: all 20 approved
Remaining decisions applied:

- MENACTRIMS rendered in Arabic as لجنة الشرق الأوسط وشمال أفريقيا لعلاج
  وأبحاث التصلب المتعدد (our translation; it publishes no Arabic name)
- the Sheikha Fatima award's presentation by HH Sheikh Mohamed bin Zayed
  restored, in the Arabic and English briefs alike so both carry the same
  facts

Confirmed unchanged: exosomes, biomarker, HERV-W, monocytes and B cells,
NEDA, the neurology clinic terms, ESMO and Harvard, and the bone marrow
transplant unit.

data/arabic-decisions.md now holds all twenty; REFERENCES-AR.md records
which were corrections and which remain our own renderings.

Co-Authored-By: Claude Opus 5 <noreply@anthropic.com>
Claude-Session: https://claude.ai/code/session_018MhQXadAbw2Qxg331AjnZL
</commit_message>
<xml_diff>
--- a/output/winners-press-release-2026-ar.docx
+++ b/output/winners-press-release-2026-ar.docx
@@ -1450,7 +1450,7 @@
                 <w:szCs w:val="22"/>
                 <w:rtl/>
               </w:rPr>
-              <w:t>وتحت قيادته حصل برنامج السكتة الدماغية في القسم على اعتماد الجمعية الألمانية للسكتة الدماغية، ونال المستشفى اعتماده مركزاً للتصلب المتعدد من منظمة MENACTRIMS، كما جرى تشغيل وحدة طب الأعصاب والسكتة الدماغية بسعة 18 سريراً التي افتُتحت عام 2019. ويحتفظ القسم بسجلات مرضية في التصلب المتعدد والخرف واعتلال الأعصاب والصداع واضطرابات الحركة والصرع، إلى جانب عيادات متخصصة في الطب العصبي العضلي والعلاج بتوكسين البوتولينوم وبرمجة التحفيز العميق للدماغ.</w:t>
+              <w:t>وتحت قيادته حصل برنامج السكتة الدماغية في القسم على اعتماد الجمعية الألمانية للسكتة الدماغية، ونال المستشفى اعتماده مركزاً للتصلب المتعدد من لجنة الشرق الأوسط وشمال أفريقيا لعلاج وأبحاث التصلب المتعدد، كما جرى تشغيل وحدة طب الأعصاب والسكتة الدماغية بسعة 18 سريراً التي افتُتحت عام 2019. ويحتفظ القسم بسجلات مرضية في التصلب المتعدد والخرف واعتلال الأعصاب والصداع واضطرابات الحركة والصرع، إلى جانب عيادات متخصصة في الطب العصبي العضلي والعلاج بتوكسين البوتولينوم وبرمجة التحفيز العميق للدماغ.</w:t>
             </w:r>
           </w:p>
           <w:p>
@@ -1602,7 +1602,7 @@
                 <w:szCs w:val="22"/>
                 <w:rtl/>
               </w:rPr>
-              <w:t>وأسهم في التطبيق الوطني لمعايير الرعاية المتقدمة للأورام عام 2024، وفي الدليل الوطني للكشف المبكر عن سرطان الرئة وتشخيصه في الدولة، وفي اللجنة الوطنية متعددة التخصصات لتقييم حالات السرطان المُنشأة بموجب القرار الوزاري رقم (20) لعام 2025. كما أسّس أول برنامج زمالة في أمراض الدم والأورام في تاريخ الدولة، وهو بروفيسور زائر في كلية الطب بجامعة هارفارد. وفي فبراير 2025 نال جائزة برنامج سمو الشيخة فاطمة بنت مبارك للتميز والذكاء المجتمعي في فئة الشخصية المتميزة.</w:t>
+              <w:t>وأسهم في التطبيق الوطني لمعايير الرعاية المتقدمة للأورام عام 2024، وفي الدليل الوطني للكشف المبكر عن سرطان الرئة وتشخيصه في الدولة، وفي اللجنة الوطنية متعددة التخصصات لتقييم حالات السرطان المُنشأة بموجب القرار الوزاري رقم (20) لعام 2025. كما أسّس أول برنامج زمالة في أمراض الدم والأورام في تاريخ الدولة، وهو بروفيسور زائر في كلية الطب بجامعة هارفارد. وفي فبراير 2025 نال جائزة برنامج سمو الشيخة فاطمة بنت مبارك للتميز والذكاء المجتمعي في فئة الشخصية المتميزة، وقد سلّمها له صاحب السمو الشيخ محمد بن زايد آل نهيان، رئيس الدولة.</w:t>
             </w:r>
           </w:p>
         </w:tc>

</xml_diff>